<commit_message>
Paket za odvetnika: vprašanja kot Wordovi komentarji ob robu
Kot v prvem pošiljanju: vsako vprašanje je komentar pri točki, na katero
se nanaša (pogoji 28 vprašanj + načrti, politika 10 vprašanj + predlogi
treh manjkajočih odstavkov in dob hrambe). Nobeno vprašanje ni v obeh
dokumentih; uvod pove, kaj je drugače od 25. 8.

Co-Authored-By: Claude Fable 5.1 <noreply@anthropic.com>
</commit_message>
<xml_diff>
--- a/docs/odvetnik-paket/2026-09-04/Pinart-Flow-Pogoji-uporabe-4-9-2026.docx
+++ b/docs/odvetnik-paket/2026-09-04/Pinart-Flow-Pogoji-uporabe-4-9-2026.docx
@@ -4,82 +4,86 @@
   <w:body>
     <w:p>
       <w:pPr>
-        <w:spacing w:after="240"/>
-        <w:keepNext/>
-      </w:pPr>
-      <w:r>
-        <w:rPr>
-          <w:b/>
-          <w:sz w:val="32"/>
-        </w:rPr>
-        <w:t xml:space="preserve">Pogoji uporabe (osnutek za pravni pregled, 2. pošiljanje)</w:t>
-      </w:r>
-    </w:p>
-    <w:p>
-      <w:pPr>
-        <w:spacing w:after="120"/>
-      </w:pPr>
-      <w:r>
-        <w:t xml:space="preserve">Različica besedila: 2026-08-31 · Živo besedilo: https://www.pinartflow.com/kalkulator/pogoji</w:t>
-      </w:r>
-    </w:p>
-    <w:p>
-      <w:pPr>
-        <w:spacing w:after="120"/>
-      </w:pPr>
-      <w:r>
-        <w:t xml:space="preserve">Prvič poslano 25. 8. 2026 (različica 2026-08-23); ta datoteka je posodobljena 4. 9. 2026.</w:t>
-      </w:r>
-    </w:p>
-    <w:p>
-      <w:pPr>
-        <w:spacing w:after="120"/>
-      </w:pPr>
-      <w:r>
-        <w:t xml:space="preserve">Stanje: objavljeno in v uporabi; pisano brez pravne pomoči. Dvojezično (SL/EN);</w:t>
-      </w:r>
-    </w:p>
-    <w:p>
-      <w:pPr>
-        <w:spacing w:after="120"/>
-      </w:pPr>
-      <w:r>
-        <w:t xml:space="preserve">točka 12 določa, da v primeru razhajanja prevlada slovenščina — spodaj je slovenski izvirnik.</w:t>
-      </w:r>
-    </w:p>
-    <w:p>
-      <w:pPr>
-        <w:spacing w:after="120"/>
-      </w:pPr>
-      <w:r>
-        <w:t xml:space="preserve">Kako brati: najprej celotno besedilo, kot ga vidi obiskovalec; na koncu so komentarji:</w:t>
-      </w:r>
-    </w:p>
-    <w:p>
-      <w:pPr>
-        <w:spacing w:after="120"/>
-      </w:pPr>
-      <w:r>
-        <w:t xml:space="preserve">kaj je drugače od prejšnjega pošiljanja in kazalo na oštevilčena vprašanja v datoteki 3.</w:t>
-      </w:r>
-    </w:p>
-    <w:p>
-      <w:pPr>
-        <w:spacing w:after="120"/>
-      </w:pPr>
+        <w:spacing w:after="200"/>
+      </w:pPr>
+      <w:r>
+        <w:rPr>
+          <w:b/>
+          <w:sz w:val="36"/>
+        </w:rPr>
+        <w:t xml:space="preserve">Pinart Flow — Pogoji uporabe (za pravni pregled, 2. pošiljanje)</w:t>
+      </w:r>
+    </w:p>
+    <w:p>
+      <w:pPr>
+        <w:spacing w:after="120"/>
+      </w:pPr>
+      <w:r>
+        <w:t xml:space="preserve">Za pravni pregled — drugo pošiljanje, 4. 9. 2026. Tina Zaletel, Pinart d.o.o., tina@pinart.si.</w:t>
+      </w:r>
+    </w:p>
+    <w:p>
+      <w:pPr>
+        <w:spacing w:after="120"/>
+      </w:pPr>
+      <w:r>
+        <w:t xml:space="preserve">Vprašanja so v komentarjih ob robu, vsako pri točki, na katero se nanaša. Oštevilčena so od 1 do 38: 1 do 18 kot v prvem pošiljanju (25. 8.), 19 do 28 pravice uporabe v kalkulatorju (26. 8.; prej pomotoma dvakrat številka 18), 29 do 38 novo. Vprašanja o osebnih podatkih so v politiki zasebnosti, vsa druga v pogojih uporabe; nobeno ni v obeh.</w:t>
+      </w:r>
+    </w:p>
+    <w:p>
+      <w:pPr>
+        <w:spacing w:after="120"/>
+      </w:pPr>
+      <w:r>
+        <w:t xml:space="preserve">Stanje 4. 9. 2026: orodje je v zaprti beti (povabljeni testerji). Javno in brez prijave delujejo brezplačni kalkulator, predstavitvene strani in vprašalnik o cenah. Plačljive naročnine tečejo prek Stripa. Najbolj me zanima, kaj moram popraviti pred odprtjem za vse in kaj lahko počaka.</w:t>
+      </w:r>
+    </w:p>
+    <w:p>
+      <w:pPr>
+        <w:spacing w:after="120"/>
+      </w:pPr>
+      <w:r>
+        <w:rPr>
+          <w:i/>
+        </w:rPr>
+        <w:t xml:space="preserve">Kaj je drugače od različice 2026-08-23, ki ste jo prejeli 25. 8.: točka 1a se imenuje »Od kod tržni okvir« (prej »Od kod priporočene cene«; orodje ne izreka priporočene cene, ampak pokaže razpon iz javno objavljenih cenikov); v 2a je Stripe poimenovan kot pooblaščeni ponudnik plačil (naročnine žive od 28. 8.); v 8a so novi podobdelovalci PostHog (EU), Stripe in AJPES. Vse drugo je nespremenjeno. Živa različica: 2026-08-31 (v nogi strani še piše 23. 8. — popravimo).</w:t>
+      </w:r>
+    </w:p>
+    <w:p>
+      <w:pPr>
+        <w:spacing w:after="200"/>
+      </w:pPr>
+      <w:r>
+        <w:t xml:space="preserve"/>
+      </w:r>
+    </w:p>
+    <w:p>
+      <w:pPr>
+        <w:spacing w:after="120"/>
+      </w:pPr>
+      <w:commentRangeStart w:id="0"/>
+      <w:commentRangeStart w:id="1"/>
       <w:r>
         <w:t xml:space="preserve">Pinart Flow je platforma družbe Pinart d.o.o., Mladinska ulica 63, 1000 Ljubljana (v nadaljevanju: ponudnik), namenjena kreativcem za izračun poštenih cen, pripravo ponudb, pogodb in računov ter vodenje strank in projektov. Brezplačni kalkulator cen je del platforme in deluje tudi brez prijave. Z uporabo platforme ali orodij se strinjaš s temi pogoji.</w:t>
       </w:r>
-    </w:p>
-    <w:p>
-      <w:pPr>
-        <w:spacing w:after="120"/>
-        <w:keepNext/>
-      </w:pPr>
-      <w:r>
-        <w:rPr>
-          <w:b/>
-          <w:sz w:val="22"/>
+      <w:commentRangeEnd w:id="0"/>
+      <w:r>
+        <w:commentReference w:id="0"/>
+      </w:r>
+      <w:commentRangeEnd w:id="1"/>
+      <w:r>
+        <w:commentReference w:id="1"/>
+      </w:r>
+    </w:p>
+    <w:p>
+      <w:pPr>
+        <w:spacing w:after="120"/>
+        <w:keepNext/>
+      </w:pPr>
+      <w:r>
+        <w:rPr>
+          <w:b/>
+          <w:sz w:val="24"/>
         </w:rPr>
         <w:t xml:space="preserve">POJMI</w:t>
       </w:r>
@@ -97,13 +101,18 @@
         <w:spacing w:after="120"/>
         <w:keepNext/>
       </w:pPr>
-      <w:r>
-        <w:rPr>
-          <w:b/>
-          <w:sz w:val="22"/>
+      <w:commentRangeStart w:id="2"/>
+      <w:r>
+        <w:rPr>
+          <w:b/>
+          <w:sz w:val="24"/>
         </w:rPr>
         <w:t xml:space="preserve">1. INFORMATIVNA NARAVA IZRAČUNOV</w:t>
       </w:r>
+      <w:commentRangeEnd w:id="2"/>
+      <w:r>
+        <w:commentReference w:id="2"/>
+      </w:r>
     </w:p>
     <w:p>
       <w:pPr>
@@ -121,7 +130,7 @@
       <w:r>
         <w:rPr>
           <w:b/>
-          <w:sz w:val="22"/>
+          <w:sz w:val="24"/>
         </w:rPr>
         <w:t xml:space="preserve">1A. OD KOD TRŽNI OKVIR</w:t>
       </w:r>
@@ -139,13 +148,23 @@
         <w:spacing w:after="120"/>
         <w:keepNext/>
       </w:pPr>
-      <w:r>
-        <w:rPr>
-          <w:b/>
-          <w:sz w:val="22"/>
+      <w:commentRangeStart w:id="3"/>
+      <w:commentRangeStart w:id="4"/>
+      <w:r>
+        <w:rPr>
+          <w:b/>
+          <w:sz w:val="24"/>
         </w:rPr>
         <w:t xml:space="preserve">2. DAVKI</w:t>
       </w:r>
+      <w:commentRangeEnd w:id="3"/>
+      <w:r>
+        <w:commentReference w:id="3"/>
+      </w:r>
+      <w:commentRangeEnd w:id="4"/>
+      <w:r>
+        <w:commentReference w:id="4"/>
+      </w:r>
     </w:p>
     <w:p>
       <w:pPr>
@@ -160,13 +179,23 @@
         <w:spacing w:after="120"/>
         <w:keepNext/>
       </w:pPr>
-      <w:r>
-        <w:rPr>
-          <w:b/>
-          <w:sz w:val="22"/>
+      <w:commentRangeStart w:id="5"/>
+      <w:commentRangeStart w:id="6"/>
+      <w:r>
+        <w:rPr>
+          <w:b/>
+          <w:sz w:val="24"/>
         </w:rPr>
         <w:t xml:space="preserve">2A. NAROČNINA IN PLAČILO</w:t>
       </w:r>
+      <w:commentRangeEnd w:id="5"/>
+      <w:r>
+        <w:commentReference w:id="5"/>
+      </w:r>
+      <w:commentRangeEnd w:id="6"/>
+      <w:r>
+        <w:commentReference w:id="6"/>
+      </w:r>
     </w:p>
     <w:p>
       <w:pPr>
@@ -197,13 +226,18 @@
         <w:spacing w:after="120"/>
         <w:keepNext/>
       </w:pPr>
-      <w:r>
-        <w:rPr>
-          <w:b/>
-          <w:sz w:val="22"/>
+      <w:commentRangeStart w:id="7"/>
+      <w:r>
+        <w:rPr>
+          <w:b/>
+          <w:sz w:val="24"/>
         </w:rPr>
         <w:t xml:space="preserve">2B. VRAČILA</w:t>
       </w:r>
+      <w:commentRangeEnd w:id="7"/>
+      <w:r>
+        <w:commentReference w:id="7"/>
+      </w:r>
     </w:p>
     <w:p>
       <w:pPr>
@@ -221,7 +255,7 @@
       <w:r>
         <w:rPr>
           <w:b/>
-          <w:sz w:val="22"/>
+          <w:sz w:val="24"/>
         </w:rPr>
         <w:t xml:space="preserve">3. BREZ JAMSTEV</w:t>
       </w:r>
@@ -239,13 +273,18 @@
         <w:spacing w:after="120"/>
         <w:keepNext/>
       </w:pPr>
-      <w:r>
-        <w:rPr>
-          <w:b/>
-          <w:sz w:val="22"/>
+      <w:commentRangeStart w:id="8"/>
+      <w:r>
+        <w:rPr>
+          <w:b/>
+          <w:sz w:val="24"/>
         </w:rPr>
         <w:t xml:space="preserve">3A. BETA / ZGODNJI DOSTOP</w:t>
       </w:r>
+      <w:commentRangeEnd w:id="8"/>
+      <w:r>
+        <w:commentReference w:id="8"/>
+      </w:r>
     </w:p>
     <w:p>
       <w:pPr>
@@ -263,7 +302,7 @@
       <w:r>
         <w:rPr>
           <w:b/>
-          <w:sz w:val="22"/>
+          <w:sz w:val="24"/>
         </w:rPr>
         <w:t xml:space="preserve">3B. RAZPOLOŽLJIVOST IN STORITVE TRETJIH</w:t>
       </w:r>
@@ -284,7 +323,7 @@
       <w:r>
         <w:rPr>
           <w:b/>
-          <w:sz w:val="22"/>
+          <w:sz w:val="24"/>
         </w:rPr>
         <w:t xml:space="preserve">3C. PODPORA</w:t>
       </w:r>
@@ -305,7 +344,7 @@
       <w:r>
         <w:rPr>
           <w:b/>
-          <w:sz w:val="22"/>
+          <w:sz w:val="24"/>
         </w:rPr>
         <w:t xml:space="preserve">4. UPORABNIŠKI RAČUN IN DOSTOP</w:t>
       </w:r>
@@ -326,7 +365,7 @@
       <w:r>
         <w:rPr>
           <w:b/>
-          <w:sz w:val="22"/>
+          <w:sz w:val="24"/>
         </w:rPr>
         <w:t xml:space="preserve">4A. KJE SE HRANIJO TVOJI PODATKI</w:t>
       </w:r>
@@ -355,7 +394,7 @@
       <w:r>
         <w:rPr>
           <w:b/>
-          <w:sz w:val="22"/>
+          <w:sz w:val="24"/>
         </w:rPr>
         <w:t xml:space="preserve">4B. KOMUNIKACIJE</w:t>
       </w:r>
@@ -373,13 +412,18 @@
         <w:spacing w:after="120"/>
         <w:keepNext/>
       </w:pPr>
-      <w:r>
-        <w:rPr>
-          <w:b/>
-          <w:sz w:val="22"/>
+      <w:commentRangeStart w:id="9"/>
+      <w:r>
+        <w:rPr>
+          <w:b/>
+          <w:sz w:val="24"/>
         </w:rPr>
         <w:t xml:space="preserve">4C. SEF AVTORSTVA</w:t>
       </w:r>
+      <w:commentRangeEnd w:id="9"/>
+      <w:r>
+        <w:commentReference w:id="9"/>
+      </w:r>
     </w:p>
     <w:p>
       <w:pPr>
@@ -413,7 +457,7 @@
       <w:r>
         <w:rPr>
           <w:b/>
-          <w:sz w:val="22"/>
+          <w:sz w:val="24"/>
         </w:rPr>
         <w:t xml:space="preserve">4D. SPREJEMLJIVA RABA</w:t>
       </w:r>
@@ -434,7 +478,7 @@
       <w:r>
         <w:rPr>
           <w:b/>
-          <w:sz w:val="22"/>
+          <w:sz w:val="24"/>
         </w:rPr>
         <w:t xml:space="preserve">4E. UPRAVIČENOST IN STAROST</w:t>
       </w:r>
@@ -455,7 +499,7 @@
       <w:r>
         <w:rPr>
           <w:b/>
-          <w:sz w:val="22"/>
+          <w:sz w:val="24"/>
         </w:rPr>
         <w:t xml:space="preserve">4F. IZVOZNI NADZOR IN SANKCIJE</w:t>
       </w:r>
@@ -473,13 +517,23 @@
         <w:spacing w:after="120"/>
         <w:keepNext/>
       </w:pPr>
-      <w:r>
-        <w:rPr>
-          <w:b/>
-          <w:sz w:val="22"/>
+      <w:commentRangeStart w:id="10"/>
+      <w:commentRangeStart w:id="11"/>
+      <w:r>
+        <w:rPr>
+          <w:b/>
+          <w:sz w:val="24"/>
         </w:rPr>
         <w:t xml:space="preserve">4G. OBDELAVA OSEBNIH PODATKOV V TVOJEM IMENU (POGODBA O OBDELAVI)</w:t>
       </w:r>
+      <w:commentRangeEnd w:id="10"/>
+      <w:r>
+        <w:commentReference w:id="10"/>
+      </w:r>
+      <w:commentRangeEnd w:id="11"/>
+      <w:r>
+        <w:commentReference w:id="11"/>
+      </w:r>
     </w:p>
     <w:p>
       <w:pPr>
@@ -529,7 +583,7 @@
       <w:r>
         <w:rPr>
           <w:b/>
-          <w:sz w:val="22"/>
+          <w:sz w:val="24"/>
         </w:rPr>
         <w:t xml:space="preserve">5. ANONIMNA STATISTIKA CEN</w:t>
       </w:r>
@@ -550,7 +604,7 @@
       <w:r>
         <w:rPr>
           <w:b/>
-          <w:sz w:val="22"/>
+          <w:sz w:val="24"/>
         </w:rPr>
         <w:t xml:space="preserve">6. IME IN E-NASLOV OB PRENOSU ALI PROFILU</w:t>
       </w:r>
@@ -571,7 +625,7 @@
       <w:r>
         <w:rPr>
           <w:b/>
-          <w:sz w:val="22"/>
+          <w:sz w:val="24"/>
         </w:rPr>
         <w:t xml:space="preserve">7. UMETNA INTELIGENCA (PUPA) IN VARNOST PODATKOV</w:t>
       </w:r>
@@ -605,13 +659,63 @@
         <w:spacing w:after="120"/>
         <w:keepNext/>
       </w:pPr>
-      <w:r>
-        <w:rPr>
-          <w:b/>
-          <w:sz w:val="22"/>
+      <w:commentRangeStart w:id="12"/>
+      <w:commentRangeStart w:id="13"/>
+      <w:commentRangeStart w:id="14"/>
+      <w:commentRangeStart w:id="15"/>
+      <w:commentRangeStart w:id="16"/>
+      <w:commentRangeStart w:id="17"/>
+      <w:commentRangeStart w:id="18"/>
+      <w:commentRangeStart w:id="19"/>
+      <w:commentRangeStart w:id="20"/>
+      <w:commentRangeStart w:id="21"/>
+      <w:r>
+        <w:rPr>
+          <w:b/>
+          <w:sz w:val="24"/>
         </w:rPr>
         <w:t xml:space="preserve">8. INTELEKTUALNA LASTNINA</w:t>
       </w:r>
+      <w:commentRangeEnd w:id="12"/>
+      <w:r>
+        <w:commentReference w:id="12"/>
+      </w:r>
+      <w:commentRangeEnd w:id="13"/>
+      <w:r>
+        <w:commentReference w:id="13"/>
+      </w:r>
+      <w:commentRangeEnd w:id="14"/>
+      <w:r>
+        <w:commentReference w:id="14"/>
+      </w:r>
+      <w:commentRangeEnd w:id="15"/>
+      <w:r>
+        <w:commentReference w:id="15"/>
+      </w:r>
+      <w:commentRangeEnd w:id="16"/>
+      <w:r>
+        <w:commentReference w:id="16"/>
+      </w:r>
+      <w:commentRangeEnd w:id="17"/>
+      <w:r>
+        <w:commentReference w:id="17"/>
+      </w:r>
+      <w:commentRangeEnd w:id="18"/>
+      <w:r>
+        <w:commentReference w:id="18"/>
+      </w:r>
+      <w:commentRangeEnd w:id="19"/>
+      <w:r>
+        <w:commentReference w:id="19"/>
+      </w:r>
+      <w:commentRangeEnd w:id="20"/>
+      <w:r>
+        <w:commentReference w:id="20"/>
+      </w:r>
+      <w:commentRangeEnd w:id="21"/>
+      <w:r>
+        <w:commentReference w:id="21"/>
+      </w:r>
     </w:p>
     <w:p>
       <w:pPr>
@@ -629,7 +733,7 @@
       <w:r>
         <w:rPr>
           <w:b/>
-          <w:sz w:val="22"/>
+          <w:sz w:val="24"/>
         </w:rPr>
         <w:t xml:space="preserve">8A. PODOBDELOVALCI</w:t>
       </w:r>
@@ -722,7 +826,7 @@
       <w:r>
         <w:rPr>
           <w:b/>
-          <w:sz w:val="22"/>
+          <w:sz w:val="24"/>
         </w:rPr>
         <w:t xml:space="preserve">8B. PODATKI TVOJIH STRANK (OBDELAVA)</w:t>
       </w:r>
@@ -740,13 +844,18 @@
         <w:spacing w:after="120"/>
         <w:keepNext/>
       </w:pPr>
-      <w:r>
-        <w:rPr>
-          <w:b/>
-          <w:sz w:val="22"/>
+      <w:commentRangeStart w:id="22"/>
+      <w:r>
+        <w:rPr>
+          <w:b/>
+          <w:sz w:val="24"/>
         </w:rPr>
         <w:t xml:space="preserve">8C. PRIJAVA SPORNE VSEBINE IN JAMSTVO</w:t>
       </w:r>
+      <w:commentRangeEnd w:id="22"/>
+      <w:r>
+        <w:commentReference w:id="22"/>
+      </w:r>
     </w:p>
     <w:p>
       <w:pPr>
@@ -764,7 +873,7 @@
       <w:r>
         <w:rPr>
           <w:b/>
-          <w:sz w:val="22"/>
+          <w:sz w:val="24"/>
         </w:rPr>
         <w:t xml:space="preserve">8D. PRIJAVA KRŠITEV AVTORSKIH PRAVIC (ZDA / DMCA)</w:t>
       </w:r>
@@ -785,7 +894,7 @@
       <w:r>
         <w:rPr>
           <w:b/>
-          <w:sz w:val="22"/>
+          <w:sz w:val="24"/>
         </w:rPr>
         <w:t xml:space="preserve">9. OMEJITEV ODGOVORNOSTI</w:t>
       </w:r>
@@ -803,13 +912,23 @@
         <w:spacing w:after="120"/>
         <w:keepNext/>
       </w:pPr>
-      <w:r>
-        <w:rPr>
-          <w:b/>
-          <w:sz w:val="22"/>
+      <w:commentRangeStart w:id="23"/>
+      <w:commentRangeStart w:id="24"/>
+      <w:r>
+        <w:rPr>
+          <w:b/>
+          <w:sz w:val="24"/>
         </w:rPr>
         <w:t xml:space="preserve">9A. ODLOČITVE NA PODLAGI ORODJA IN AI</w:t>
       </w:r>
+      <w:commentRangeEnd w:id="23"/>
+      <w:r>
+        <w:commentReference w:id="23"/>
+      </w:r>
+      <w:commentRangeEnd w:id="24"/>
+      <w:r>
+        <w:commentReference w:id="24"/>
+      </w:r>
     </w:p>
     <w:p>
       <w:pPr>
@@ -827,7 +946,7 @@
       <w:r>
         <w:rPr>
           <w:b/>
-          <w:sz w:val="22"/>
+          <w:sz w:val="24"/>
         </w:rPr>
         <w:t xml:space="preserve">9B. ODŠKODNINSKA ZAŠČITA</w:t>
       </w:r>
@@ -848,7 +967,7 @@
       <w:r>
         <w:rPr>
           <w:b/>
-          <w:sz w:val="22"/>
+          <w:sz w:val="24"/>
         </w:rPr>
         <w:t xml:space="preserve">9C. VIŠJA SILA</w:t>
       </w:r>
@@ -869,7 +988,7 @@
       <w:r>
         <w:rPr>
           <w:b/>
-          <w:sz w:val="22"/>
+          <w:sz w:val="24"/>
         </w:rPr>
         <w:t xml:space="preserve">10. ODPOVED IN PRENEHANJE</w:t>
       </w:r>
@@ -890,7 +1009,7 @@
       <w:r>
         <w:rPr>
           <w:b/>
-          <w:sz w:val="22"/>
+          <w:sz w:val="24"/>
         </w:rPr>
         <w:t xml:space="preserve">10A. PRENOS POGODBE</w:t>
       </w:r>
@@ -908,13 +1027,18 @@
         <w:spacing w:after="120"/>
         <w:keepNext/>
       </w:pPr>
-      <w:r>
-        <w:rPr>
-          <w:b/>
-          <w:sz w:val="22"/>
+      <w:commentRangeStart w:id="25"/>
+      <w:r>
+        <w:rPr>
+          <w:b/>
+          <w:sz w:val="24"/>
         </w:rPr>
         <w:t xml:space="preserve">10B. PRENEHANJE STORITVE IN IZVOZ PODATKOV</w:t>
       </w:r>
+      <w:commentRangeEnd w:id="25"/>
+      <w:r>
+        <w:commentReference w:id="25"/>
+      </w:r>
     </w:p>
     <w:p>
       <w:pPr>
@@ -932,7 +1056,7 @@
       <w:r>
         <w:rPr>
           <w:b/>
-          <w:sz w:val="22"/>
+          <w:sz w:val="24"/>
         </w:rPr>
         <w:t xml:space="preserve">11. VELJAVNO PRAVO IN PRISTOJNOST</w:t>
       </w:r>
@@ -953,7 +1077,7 @@
       <w:r>
         <w:rPr>
           <w:b/>
-          <w:sz w:val="22"/>
+          <w:sz w:val="24"/>
         </w:rPr>
         <w:t xml:space="preserve">11A. OBVEŠČANJE</w:t>
       </w:r>
@@ -974,7 +1098,7 @@
       <w:r>
         <w:rPr>
           <w:b/>
-          <w:sz w:val="22"/>
+          <w:sz w:val="24"/>
         </w:rPr>
         <w:t xml:space="preserve">11B. DELNA NEVELJAVNOST</w:t>
       </w:r>
@@ -995,7 +1119,7 @@
       <w:r>
         <w:rPr>
           <w:b/>
-          <w:sz w:val="22"/>
+          <w:sz w:val="24"/>
         </w:rPr>
         <w:t xml:space="preserve">11C. CELOVIT DOGOVOR IN ODPOVED UVELJAVLJANJA</w:t>
       </w:r>
@@ -1013,13 +1137,18 @@
         <w:spacing w:after="120"/>
         <w:keepNext/>
       </w:pPr>
-      <w:r>
-        <w:rPr>
-          <w:b/>
-          <w:sz w:val="22"/>
+      <w:commentRangeStart w:id="26"/>
+      <w:r>
+        <w:rPr>
+          <w:b/>
+          <w:sz w:val="24"/>
         </w:rPr>
         <w:t xml:space="preserve">11D. REŠEVANJE SPOROV ZA UPORABNIKE V ZDA (ARBITRAŽA)</w:t>
       </w:r>
+      <w:commentRangeEnd w:id="26"/>
+      <w:r>
+        <w:commentReference w:id="26"/>
+      </w:r>
     </w:p>
     <w:p>
       <w:pPr>
@@ -1037,7 +1166,7 @@
       <w:r>
         <w:rPr>
           <w:b/>
-          <w:sz w:val="22"/>
+          <w:sz w:val="24"/>
         </w:rPr>
         <w:t xml:space="preserve">12. JEZIK</w:t>
       </w:r>
@@ -1055,13 +1184,28 @@
         <w:spacing w:after="120"/>
         <w:keepNext/>
       </w:pPr>
-      <w:r>
-        <w:rPr>
-          <w:b/>
-          <w:sz w:val="22"/>
+      <w:commentRangeStart w:id="27"/>
+      <w:commentRangeStart w:id="28"/>
+      <w:commentRangeStart w:id="29"/>
+      <w:r>
+        <w:rPr>
+          <w:b/>
+          <w:sz w:val="24"/>
         </w:rPr>
         <w:t xml:space="preserve">13. SPREMEMBE</w:t>
       </w:r>
+      <w:commentRangeEnd w:id="27"/>
+      <w:r>
+        <w:commentReference w:id="27"/>
+      </w:r>
+      <w:commentRangeEnd w:id="28"/>
+      <w:r>
+        <w:commentReference w:id="28"/>
+      </w:r>
+      <w:commentRangeEnd w:id="29"/>
+      <w:r>
+        <w:commentReference w:id="29"/>
+      </w:r>
     </w:p>
     <w:p>
       <w:pPr>
@@ -1077,206 +1221,6 @@
       </w:pPr>
       <w:r>
         <w:t xml:space="preserve">Različica 2026-08-31 · Zadnja sprememba: 23. 8. 2026 · Kontakt: tina@pinart.si</w:t>
-      </w:r>
-    </w:p>
-    <w:p>
-      <w:pPr>
-        <w:spacing w:after="160"/>
-        <w:keepNext/>
-      </w:pPr>
-      <w:r>
-        <w:rPr>
-          <w:b/>
-          <w:sz w:val="26"/>
-        </w:rPr>
-        <w:t xml:space="preserve">KOMENTARJI ZA PREGLED TEGA DOKUMENTA</w:t>
-      </w:r>
-    </w:p>
-    <w:p>
-      <w:pPr>
-        <w:spacing w:after="120"/>
-      </w:pPr>
-      <w:r>
-        <w:t xml:space="preserve">Kaj je drugače od različice 2026-08-23, ki ste jo prejeli 25. 8. 2026:</w:t>
-      </w:r>
-    </w:p>
-    <w:p>
-      <w:pPr>
-        <w:ind w:left="567"/>
-        <w:spacing w:after="40"/>
-      </w:pPr>
-      <w:r>
-        <w:t xml:space="preserve">1a — naslov »Od kod tržni okvir« (prej »Od kod priporočene cene«); orodje ne izreka</w:t>
-      </w:r>
-    </w:p>
-    <w:p>
-      <w:pPr>
-        <w:ind w:left="567"/>
-        <w:spacing w:after="40"/>
-      </w:pPr>
-      <w:r>
-        <w:t xml:space="preserve">»priporočene cene«, ampak pokaže razpon iz javno objavljenih cenikov; vsebina točke enaka</w:t>
-      </w:r>
-    </w:p>
-    <w:p>
-      <w:pPr>
-        <w:ind w:left="567"/>
-        <w:spacing w:after="40"/>
-      </w:pPr>
-      <w:r>
-        <w:t xml:space="preserve">2a — Stripe je poimenovan kot pooblaščeni ponudnik plačil (merchant of record); naročnine so žive od 28. 8.</w:t>
-      </w:r>
-    </w:p>
-    <w:p>
-      <w:pPr>
-        <w:ind w:left="567"/>
-        <w:spacing w:after="40"/>
-      </w:pPr>
-      <w:r>
-        <w:t xml:space="preserve">8a — novi podobdelovalci: PostHog (EU), Stripe, AJPES</w:t>
-      </w:r>
-    </w:p>
-    <w:p>
-      <w:pPr>
-        <w:ind w:left="567"/>
-        <w:spacing w:after="40"/>
-      </w:pPr>
-      <w:r>
-        <w:t xml:space="preserve">Vse drugo je nespremenjeno. (V nogi strani še piše »Zadnja sprememba: 23. 8. 2026« — popravimo na 31. 8.)</w:t>
-      </w:r>
-    </w:p>
-    <w:p>
-      <w:pPr>
-        <w:spacing w:after="120"/>
-      </w:pPr>
-      <w:r>
-        <w:t xml:space="preserve">Oštevilčena vprašanja so v datoteki 3 (Vprašanja in komentarji, različica 3):</w:t>
-      </w:r>
-    </w:p>
-    <w:p>
-      <w:pPr>
-        <w:ind w:left="567"/>
-        <w:spacing w:after="40"/>
-      </w:pPr>
-      <w:r>
-        <w:t xml:space="preserve">Točka pogojev   ·   Vprašanje v datoteki 3</w:t>
-      </w:r>
-    </w:p>
-    <w:p>
-      <w:pPr>
-        <w:ind w:left="567"/>
-        <w:spacing w:after="40"/>
-      </w:pPr>
-      <w:r>
-        <w:t xml:space="preserve">1, 1a — informativna narava, tržni okvir   ·   4, 28, 29 (d)</w:t>
-      </w:r>
-    </w:p>
-    <w:p>
-      <w:pPr>
-        <w:ind w:left="567"/>
-        <w:spacing w:after="40"/>
-      </w:pPr>
-      <w:r>
-        <w:t xml:space="preserve">2a, 2b — naročnina, vračila, cene z DDV   ·   7, 11, 38</w:t>
-      </w:r>
-    </w:p>
-    <w:p>
-      <w:pPr>
-        <w:ind w:left="567"/>
-        <w:spacing w:after="40"/>
-      </w:pPr>
-      <w:r>
-        <w:t xml:space="preserve">3a — beta   ·   8</w:t>
-      </w:r>
-    </w:p>
-    <w:p>
-      <w:pPr>
-        <w:ind w:left="567"/>
-        <w:spacing w:after="40"/>
-      </w:pPr>
-      <w:r>
-        <w:t xml:space="preserve">4c — Sef avtorstva   ·   6</w:t>
-      </w:r>
-    </w:p>
-    <w:p>
-      <w:pPr>
-        <w:ind w:left="567"/>
-        <w:spacing w:after="40"/>
-      </w:pPr>
-      <w:r>
-        <w:t xml:space="preserve">4g, 8b — pogodba o obdelavi   ·   2, 30, 35</w:t>
-      </w:r>
-    </w:p>
-    <w:p>
-      <w:pPr>
-        <w:ind w:left="567"/>
-        <w:spacing w:after="40"/>
-      </w:pPr>
-      <w:r>
-        <w:t xml:space="preserve">7 — Pupa   ·   3</w:t>
-      </w:r>
-    </w:p>
-    <w:p>
-      <w:pPr>
-        <w:ind w:left="567"/>
-        <w:spacing w:after="40"/>
-      </w:pPr>
-      <w:r>
-        <w:t xml:space="preserve">8a — podobdelovalci   ·   14, 31, 32, 37</w:t>
-      </w:r>
-    </w:p>
-    <w:p>
-      <w:pPr>
-        <w:ind w:left="567"/>
-        <w:spacing w:after="40"/>
-      </w:pPr>
-      <w:r>
-        <w:t xml:space="preserve">8d — DMCA   ·   13</w:t>
-      </w:r>
-    </w:p>
-    <w:p>
-      <w:pPr>
-        <w:ind w:left="567"/>
-        <w:spacing w:after="40"/>
-      </w:pPr>
-      <w:r>
-        <w:t xml:space="preserve">9a — odločitve na podlagi orodja in AI   ·   4, 32 (d)</w:t>
-      </w:r>
-    </w:p>
-    <w:p>
-      <w:pPr>
-        <w:ind w:left="567"/>
-        <w:spacing w:after="40"/>
-      </w:pPr>
-      <w:r>
-        <w:t xml:space="preserve">11d — arbitraža ZDA   ·   13</w:t>
-      </w:r>
-    </w:p>
-    <w:p>
-      <w:pPr>
-        <w:ind w:left="567"/>
-        <w:spacing w:after="40"/>
-      </w:pPr>
-      <w:r>
-        <w:t xml:space="preserve">celotni dokument   ·   1 in 33 (davčna blagajna — NAJBOLJ PEREČE), 12 (predloge pogodb),</w:t>
-      </w:r>
-    </w:p>
-    <w:p>
-      <w:pPr>
-        <w:ind w:left="567"/>
-        <w:spacing w:after="40"/>
-      </w:pPr>
-      <w:r>
-        <w:t xml:space="preserve">17 (odstavki za funkcije, ki še ne delujejo), 34 (pravice v dokumentih),</w:t>
-      </w:r>
-    </w:p>
-    <w:p>
-      <w:pPr>
-        <w:ind w:left="567"/>
-        <w:spacing w:after="40"/>
-      </w:pPr>
-      <w:r>
-        <w:t xml:space="preserve">35 (ekipe — manjka točka 4h), 36 (evidenca delovnega časa)</w:t>
       </w:r>
     </w:p>
     <w:sectPr>
@@ -1285,6 +1229,391 @@
     </w:sectPr>
   </w:body>
 </w:document>
+</file>
+
+<file path=word/comments.xml><?xml version="1.0" encoding="utf-8"?>
+<w:comments xmlns:w="http://schemas.openxmlformats.org/wordprocessingml/2006/main">
+  <w:comment w:id="0" w:author="Tina Zaletel" w:initials="TZ" w:date="2026-09-04T09:00:00Z">
+    <w:p>
+      <w:r>
+        <w:annotationRef/>
+      </w:r>
+      <w:r>
+        <w:t xml:space="preserve">16. Brezplačni kalkulator. Ker deluje brez računa in se pri meni ne shrani nič razen anonimne cenovne vrstice, obiskovalcu ob vstopu pokažem kratko kartico s tremi bistvenimi točkami in povezavama na pogoje in zasebnost, celotne pogoje s potrditvijo pa šele ob prvem izvozu ali pošiljanju. Je tak dvostopenjski pristop v redu ali potrebujem ločene, krajše pogoje samo za kalkulator?</w:t>
+      </w:r>
+    </w:p>
+  </w:comment>
+  <w:comment w:id="1" w:author="Tina Zaletel" w:initials="TZ" w:date="2026-09-04T09:00:00Z">
+    <w:p>
+      <w:r>
+        <w:annotationRef/>
+      </w:r>
+      <w:r>
+        <w:t xml:space="preserve">12. Predloge pogodb. V orodju so predloge pogodb med kreativcem in njegovo stranko, s privzetimi vrednostmi (obseg pravic, rok, avans). Kakšna je moja odgovornost za vsebino teh predlog?</w:t>
+      </w:r>
+    </w:p>
+  </w:comment>
+  <w:comment w:id="2" w:author="Tina Zaletel" w:initials="TZ" w:date="2026-09-04T09:00:00Z">
+    <w:p>
+      <w:r>
+        <w:annotationRef/>
+      </w:r>
+      <w:r>
+        <w:t xml:space="preserve">4. Cene, ki jih orodje priporoči. Privzete cene in množitelji so nastali iz AI raziskave trga: iz javnih cenikov, priporočil stanovskih združenj in primerjav objavljenih cen. Niso izmerjena statistika; to bazo šele gradim iz anonimnih izračunov. V pogojih pišem, da so informativni in da je končna cena odločitev uporabnika. Je to dovolj, da me ne doleti odgovornost, če nekdo po mojem predlogu zaračuna preveč ali premalo?</w:t>
+      </w:r>
+    </w:p>
+  </w:comment>
+  <w:comment w:id="3" w:author="Tina Zaletel" w:initials="TZ" w:date="2026-09-04T09:00:00Z">
+    <w:p>
+      <w:r>
+        <w:annotationRef/>
+      </w:r>
+      <w:r>
+        <w:t xml:space="preserve">1. Računi in FURS. Flow izdaja račune, ni pa davčna blagajna in računov ne potrjuje pri FURS. Namenjeni so plačilu na transakcijski račun. Bojim se primera, ko uporabnik izda račun pri meni, plačilo prejme v gotovini in misli, da je davčno vse urejeno. Kako naj to omejitev zapišem, da je odgovornost jasno na uporabniku? Tako sem ga zaenkrat zapisala sama, prosim, popravite ga po svoje:</w:t>
+      </w:r>
+    </w:p>
+    <w:p>
+      <w:r>
+        <w:t xml:space="preserve">Pinart Flow ni davčna blagajna in ne izvaja davčnega potrjevanja računov pri FURS. Računi, izdani v Flowu, so namenjeni plačilu z nakazilom na transakcijski račun. Če uporabnik prejema plačila v gotovini, s plačilno kartico na prodajnem mestu ali na drug način, ki se šteje za gotovinsko poslovanje, mora za izdajo računov uporabiti ustrezno davčno blagajno. Za skladnost s predpisi o davčnem potrjevanju računov odgovarja uporabnik.</w:t>
+      </w:r>
+    </w:p>
+    <w:p>
+      <w:r>
+        <w:t xml:space="preserve">(Dopolnitev 4. 9.: to velja še naprej, dokler je modul iz vprašanja 33 izklopljen.)</w:t>
+      </w:r>
+    </w:p>
+  </w:comment>
+  <w:comment w:id="4" w:author="Tina Zaletel" w:initials="TZ" w:date="2026-09-04T09:00:00Z">
+    <w:p>
+      <w:r>
+        <w:annotationRef/>
+      </w:r>
+      <w:r>
+        <w:t xml:space="preserve">33. Davčna blagajna: zgrajena, izklopljena (2. 9.). Modul za izdajo računov z gotovino ali kartico, davčno potrjevanje pri FURS (ZOI, EOR, QR-koda), storno in nastavitve poslovnih prostorov je v orodju zgrajen, a izklopljen (uporabnik ga vidi, ne more ga uporabiti). Vklop načrtujem po zagonu z zunanjim izvajalcem, ki bo del za FURS poganjal na ločenem strežniku. Uporabnikovo namensko digitalno potrdilo FURS se hrani šifrirano; ključ ni v bazi. Vprašanja: (a) dokler je izklopljen, ostane besedilo iz vprašanja 1 — kako naj se glasi, ko se vklopi (uporabnik ostane zavezanec, Flow je programska oprema; katere obveznosti ima proizvajalec programske opreme po ZDavPR, na primer izjava o skladnosti); (b) hramba uporabnikovega potrdila v mojem sistemu in pri zunanjem izvajalcu (32. člen GDPR, pogodba o obdelavi z izvajalcem); (c) račun bi kupcu privzeto izročili elektronsko (QR-koda na zaslonu, SMS ali e-pošta), tiskanje kot možnost — prosim za potrditev, da to ustreza ZDavPR-B (»v elektronski ali papirni obliki«).</w:t>
+      </w:r>
+    </w:p>
+  </w:comment>
+  <w:comment w:id="5" w:author="Tina Zaletel" w:initials="TZ" w:date="2026-09-04T09:00:00Z">
+    <w:p>
+      <w:r>
+        <w:annotationRef/>
+      </w:r>
+      <w:r>
+        <w:t xml:space="preserve">11. Ustanovna cena. Razmišljam o ponudbi »ustanovna cena ostane enaka, dokler naročnina neprekinjeno traja«. Ali me taka obljuba zavezuje za vedno in kako naj jo zapišem, da jo lahko izpolnim? (Odločitev je padla 30. 8. — glej vprašanje 38.)</w:t>
+      </w:r>
+    </w:p>
+  </w:comment>
+  <w:comment w:id="6" w:author="Tina Zaletel" w:initials="TZ" w:date="2026-09-04T09:00:00Z">
+    <w:p>
+      <w:r>
+        <w:annotationRef/>
+      </w:r>
+      <w:r>
+        <w:t xml:space="preserve">38. Cene: tri lestvice (odločeno 30. 8.). Ustanovna cena za prvih 50 (9 € na mesec), uvodna do 31. 10. 2026 (15 € oziroma 29 €) in redna (23 € oziroma 48 €; ob letnem plačilu 18 € oziroma 35 € na mesec). Vse cene so končne, z DDV, ker Stripe kot pooblaščeni ponudnik plačil obračuna DDV po državi kupca. Obljuba: kdor je naročen, obdrži svojo ceno, dokler naročnina neprekinjeno traja. Vprašanja: kako to zapisati v točko 2a, da je zaveza izpolnljiva (vprašanje 11); ali je sklic »končna cena z DDV« pravilen, ko kupec ni potrošnik in DDV odbija.</w:t>
+      </w:r>
+    </w:p>
+  </w:comment>
+  <w:comment w:id="7" w:author="Tina Zaletel" w:initials="TZ" w:date="2026-09-04T09:00:00Z">
+    <w:p>
+      <w:r>
+        <w:annotationRef/>
+      </w:r>
+      <w:r>
+        <w:t xml:space="preserve">7. Potrošniki proti podjetjem. Orodje je namenjeno poslovni rabi, a samostojni kreativci so pogosto tudi potrošniki. Katere določbe moram prilagoditi, da so pravice potrošnikov spoštovane (odstop od pogodbe, vračila)?</w:t>
+      </w:r>
+    </w:p>
+  </w:comment>
+  <w:comment w:id="8" w:author="Tina Zaletel" w:initials="TZ" w:date="2026-09-04T09:00:00Z">
+    <w:p>
+      <w:r>
+        <w:annotationRef/>
+      </w:r>
+      <w:r>
+        <w:t xml:space="preserve">8. Zaprta beta. Dostop je po vabilu, funkcije se še spreminjajo, podatki se lahko ponastavijo. Kako to zapisati, da je pošteno in hkrati varno?</w:t>
+      </w:r>
+    </w:p>
+  </w:comment>
+  <w:comment w:id="9" w:author="Tina Zaletel" w:initials="TZ" w:date="2026-09-04T09:00:00Z">
+    <w:p>
+      <w:r>
+        <w:annotationRef/>
+      </w:r>
+      <w:r>
+        <w:t xml:space="preserve">6. Sef avtorstva. Shrani kriptografski odtis datoteke in datum, časovni žig pa naredi neodvisen overitelj po standardu RFC 3161. Pišem, da to dokazuje obstoj dela na določen dan, ne pa avtorstva. Je taka formulacija dovolj previdna?</w:t>
+      </w:r>
+    </w:p>
+  </w:comment>
+  <w:comment w:id="10" w:author="Tina Zaletel" w:initials="TZ" w:date="2026-09-04T09:00:00Z">
+    <w:p>
+      <w:r>
+        <w:annotationRef/>
+      </w:r>
+      <w:r>
+        <w:t xml:space="preserve">2. Podatki strank mojih uporabnikov. V Flow vnašajo imena, naslove, davčne številke in vsebino komunikacije svojih strank. Razumem, da sem pri tem obdelovalec, uporabnik pa upravljavec, in sem pogodbo o obdelavi napisala kar v pogoje (točka 4g). Ali to zadošča po 28. členu GDPR ali potrebujem ločen dokument, ki ga vsak podpiše posebej?</w:t>
+      </w:r>
+    </w:p>
+  </w:comment>
+  <w:comment w:id="11" w:author="Tina Zaletel" w:initials="TZ" w:date="2026-09-04T09:00:00Z">
+    <w:p>
+      <w:r>
+        <w:annotationRef/>
+      </w:r>
+      <w:r>
+        <w:t xml:space="preserve">35. Ekipe (zgrajeno, v zaprti beti). Uporabnik ustvari organizacijo, povabi sodelavce po e-pošti, določa vloge (lastnik, član), lahko prenese lastništvo; brezplačni paket ima 3 sedeže, Pro 25. Povabljeni sodelavec vidi podatke organizacije (stranke, projekte, dokumente) in vanje vnaša svoje. Vprašanja: kdo je upravljavec za podatke, ki jih vnese sodelavec (organizacija kot podjetje uporabnika?); kaj mora v pogoje (nova točka 4h); kaj se zgodi z vnosi člana, ko ga lastnik odstrani; vabilo vsebuje e-naslov vabljene osebe pred njenim sprejemom — koliko časa ga smem hraniti, če vabila ne sprejme.</w:t>
+      </w:r>
+    </w:p>
+  </w:comment>
+  <w:comment w:id="12" w:author="Tina Zaletel" w:initials="TZ" w:date="2026-09-04T09:00:00Z">
+    <w:p>
+      <w:r>
+        <w:annotationRef/>
+      </w:r>
+      <w:r>
+        <w:t xml:space="preserve">19. Postavitev proti oblikovanju. V orodju trdim, da postavitev spletne strani po kupljeni predlogi ni avtorsko delo in da zato zanjo ni prenosa pravic; avtorsko delo je oblikovanje, ki ga izvajalka ustvari sama. Ali to drži? Zanima me predvsem, kje je meja: koliko prilagoditve tuje predloge (barve, tipografija, postavitev sekcij, lastne komponente) že ustvari novo avtorsko delo, in kako naj to zapišem, da ne obljubljam nečesa, kar ni moje.</w:t>
+      </w:r>
+    </w:p>
+  </w:comment>
+  <w:comment w:id="13" w:author="Tina Zaletel" w:initials="TZ" w:date="2026-09-04T09:00:00Z">
+    <w:p>
+      <w:r>
+        <w:annotationRef/>
+      </w:r>
+      <w:r>
+        <w:t xml:space="preserve">20. Pravice, vključene v ceno izvedbe. Izvajalka lahko izbere, da so pravice uporabe zajete v ceni oblikovanja in se ne zaračunajo posebej. Ali mora biti obseg (teritorij, mediji, doba, izključnost) tudi v tem primeru izrecno zapisan, da je prenos veljaven? Bojim se položaja, ko se izvajalka odloči za »vključeno v ceno«, misli pa, da je s tem obseg samoumevno neomejen.</w:t>
+      </w:r>
+    </w:p>
+  </w:comment>
+  <w:comment w:id="14" w:author="Tina Zaletel" w:initials="TZ" w:date="2026-09-04T09:00:00Z">
+    <w:p>
+      <w:r>
+        <w:annotationRef/>
+      </w:r>
+      <w:r>
+        <w:t xml:space="preserve">21. Kaj pomeni molk. Privzeto pravilo v orodju je, da neodgovorjeno vprašanje ne pomeni dovoljenja: če obseg ni dogovorjen, se ne šteje za dovoljeno uporabo, ampak za nedogovorjeno. Vsako vprašanje ima izrecno izbiro »Še ni dogovorjeno«. Ali je taka razlaga skladna z zakonom in kako naj bo zapisana v ponudbi, da drži tudi ob sporu?</w:t>
+      </w:r>
+    </w:p>
+  </w:comment>
+  <w:comment w:id="15" w:author="Tina Zaletel" w:initials="TZ" w:date="2026-09-04T09:00:00Z">
+    <w:p>
+      <w:r>
+        <w:annotationRef/>
+      </w:r>
+      <w:r>
+        <w:t xml:space="preserve">22. Ali ponudba zadošča pisni obliki. Prenos materialnih avtorskih pravic mora biti pisen. V praksi izvajalka pošlje PDF ponudbo, v kateri so pogoji uporabe izpisani pri vsaki storitvi, naročnik pa jo potrdi po elektronski pošti ali s klikom. Ali to zadošča, ali je za veljaven prenos nujna ločena podpisana pogodba? Če zadošča, kaj mora ponudba nujno vsebovati?</w:t>
+      </w:r>
+    </w:p>
+  </w:comment>
+  <w:comment w:id="16" w:author="Tina Zaletel" w:initials="TZ" w:date="2026-09-04T09:00:00Z">
+    <w:p>
+      <w:r>
+        <w:annotationRef/>
+      </w:r>
+      <w:r>
+        <w:t xml:space="preserve">23. Tuja gradiva v izdelku. V delo pogosto vstopijo predloge, pisave, fotografije in vtičniki drugih avtorjev. V orodju jih ločujem od avtorskih pravic izvajalke in jih imenujem licence. Kaj mora ponudba povedati, da odgovornost za njihove licence nosi naročnik in ne izvajalka, in kaj se zgodi, če izvajalka licenco kupi na svoje ime, izdelek pa uporablja naročnik?</w:t>
+      </w:r>
+    </w:p>
+  </w:comment>
+  <w:comment w:id="17" w:author="Tina Zaletel" w:initials="TZ" w:date="2026-09-04T09:00:00Z">
+    <w:p>
+      <w:r>
+        <w:annotationRef/>
+      </w:r>
+      <w:r>
+        <w:t xml:space="preserve">24. Logotip in znamka. Prenos avtorskih pravic na logotipu ni registracija znamke. Ali naj pogodba to izrecno loči, kdo nosi stroške registracije in ali mora izvajalka naročnika na to opozoriti? Zanima me tudi, ali je za oblikovalko kakšno tveganje, če naročnik logotip registrira kot znamko, izvajalka pa podobno rešitev pozneje uporabi pri drugem naročniku.</w:t>
+      </w:r>
+    </w:p>
+  </w:comment>
+  <w:comment w:id="18" w:author="Tina Zaletel" w:initials="TZ" w:date="2026-09-04T09:00:00Z">
+    <w:p>
+      <w:r>
+        <w:annotationRef/>
+      </w:r>
+      <w:r>
+        <w:t xml:space="preserve">25. Časovno omejene licence. Pri kampanjah in oglasnih materialih orodje privzeto predlaga licenco za obdobje (na primer tri mesece). Kaj se zgodi, če naročnik gradivo uporablja po izteku: je to kršitev pogodbe ali avtorske pravice, in katero določbo naj vključim, da je posledica jasna vnaprej?</w:t>
+      </w:r>
+    </w:p>
+  </w:comment>
+  <w:comment w:id="19" w:author="Tina Zaletel" w:initials="TZ" w:date="2026-09-04T09:00:00Z">
+    <w:p>
+      <w:r>
+        <w:annotationRef/>
+      </w:r>
+      <w:r>
+        <w:t xml:space="preserve">26. Tantieme pri prodajnih produktih. Pri izdelkih za prodajo orodje namesto enkratnega odkupa predlaga honorar in tantieme od prodaje, s predujmom kot minimalno garancijo, vračilom pravic ob prekinitvi in letnim poročanjem o prodaji. Ali so take določbe v Sloveniji uveljavljive in kaj mora pogodba vsebovati, da je poročanje izvršljivo?</w:t>
+      </w:r>
+    </w:p>
+  </w:comment>
+  <w:comment w:id="20" w:author="Tina Zaletel" w:initials="TZ" w:date="2026-09-04T09:00:00Z">
+    <w:p>
+      <w:r>
+        <w:annotationRef/>
+      </w:r>
+      <w:r>
+        <w:t xml:space="preserve">27. Poimenovanje v orodju. V vmesniku uporabljam izraz »pravice uporabe (avtorske pravice)« za delo izvajalke in »licenca« za tuja gradiva, ker je uporabnicam razumljivejši; v pogodbi pa piše »materialne avtorske pravice«. Ali je tako dvojno poimenovanje sprejemljivo, dokler je pogodbeno besedilo pravno pravilno?</w:t>
+      </w:r>
+    </w:p>
+  </w:comment>
+  <w:comment w:id="21" w:author="Tina Zaletel" w:initials="TZ" w:date="2026-09-04T09:00:00Z">
+    <w:p>
+      <w:r>
+        <w:annotationRef/>
+      </w:r>
+      <w:r>
+        <w:t xml:space="preserve">34. Pravice v ponudbi in pogodbi: konkretni stavki (4. 9.). Navezuje se na vprašanja 20 do 22. Pri vsaki storitvi ima izvajalka tri možnosti in dokument zdaj pri vsaki izpiše svoj stavek:</w:t>
+      </w:r>
+    </w:p>
+    <w:p>
+      <w:r>
+        <w:t xml:space="preserve">– ločena postavka: »pravice uporabe za [obseg] ([vrsta prenosa], [trajanje]) so ločena postavka: [znesek]«;</w:t>
+      </w:r>
+    </w:p>
+    <w:p>
+      <w:r>
+        <w:t xml:space="preserve">– vključeno v ceno: »pravice uporabe za [obseg] ([vrsta], [trajanje]) so vključene v ceno storitve«;</w:t>
+      </w:r>
+    </w:p>
+    <w:p>
+      <w:r>
+        <w:t xml:space="preserve">– neoznačeno: »naročnik pridobi pravico uporabe dela za dogovorjeni namen brez ločenega doplačila; širša ali izključna uporaba se dogovori posebej«.</w:t>
+      </w:r>
+    </w:p>
+    <w:p>
+      <w:r>
+        <w:t xml:space="preserve">Člen o avtorskih pravicah v pogodbi dobi dodatek: »Kjer ponudba pravic ne navaja posebej, naročnik pridobi pravico uporabe dela za dogovorjeni namen brez ločenega doplačila; širša ali izključna uporaba se dogovori posebej. Moralne avtorske pravice ostanejo avtorju.« Prosim za pregled formulacij: so pravno zadostne, in je tretja (neoznačeno) v skladu s pravilom iz vprašanja 21, da molk ni neomejeno dovoljenje?</w:t>
+      </w:r>
+    </w:p>
+  </w:comment>
+  <w:comment w:id="22" w:author="Tina Zaletel" w:initials="TZ" w:date="2026-09-04T09:00:00Z">
+    <w:p>
+      <w:r>
+        <w:annotationRef/>
+      </w:r>
+      <w:r>
+        <w:t xml:space="preserve">10. Priponke. Uporabniki lahko k projektom in pošti pripenjajo datoteke (slike, PDF, tudi SVG). Shranjene so v zasebni shrambi v EU. Moram za naložene vsebine dodati kaj več, kot imam v točki 8c (prijava sporne vsebine)?</w:t>
+      </w:r>
+    </w:p>
+  </w:comment>
+  <w:comment w:id="23" w:author="Tina Zaletel" w:initials="TZ" w:date="2026-09-04T09:00:00Z">
+    <w:p>
+      <w:r>
+        <w:annotationRef/>
+      </w:r>
+      <w:r>
+        <w:t xml:space="preserve">28. Predlagani zneski. Orodje predlaga ceno pravic na podlagi obsega uporabe in podatkov o naročniku, izvajalka pa jo lahko kadar koli spremeni. Ob predlogu piše, da gre za priporočilo in ne za pravni nasvet. Je tak zapis dovolj, ali naj bo opozorilo tudi v sami ponudbi, ki jo prejme naročnik?</w:t>
+      </w:r>
+    </w:p>
+  </w:comment>
+  <w:comment w:id="24" w:author="Tina Zaletel" w:initials="TZ" w:date="2026-09-04T09:00:00Z">
+    <w:p>
+      <w:r>
+        <w:annotationRef/>
+      </w:r>
+      <w:r>
+        <w:t xml:space="preserve">36. Evidenca delovnega časa (od 30. 8.). Uporabnik (in člani njegove ekipe) beležijo prihod, malico in odhod s štoparico; nastane mesečna tabela s seštevki in izvoz CSV. Namen je evidenca po ZEPDSV. Vprašanja: kaj mora orodje zagotoviti, da se evidenca šteje za ustrezno (nespremenljivost oziroma revizijska sled popravkov, seznanitev delavca, hramba); ali moram izrecno zapisati, da je za pravilnost in hrambo odgovoren delodajalec; kako dolgo morajo biti podatki dosegljivi po prenehanju naročnine.</w:t>
+      </w:r>
+    </w:p>
+  </w:comment>
+  <w:comment w:id="25" w:author="Tina Zaletel" w:initials="TZ" w:date="2026-09-04T09:00:00Z">
+    <w:p>
+      <w:r>
+        <w:annotationRef/>
+      </w:r>
+      <w:r>
+        <w:t xml:space="preserve">9. Izbris in izvoz. Uporabnik lahko podatke kadarkoli izvozi, izbris zahteva po e-pošti. Moram izbris ponuditi kot gumb v aplikaciji?</w:t>
+      </w:r>
+    </w:p>
+  </w:comment>
+  <w:comment w:id="26" w:author="Tina Zaletel" w:initials="TZ" w:date="2026-09-04T09:00:00Z">
+    <w:p>
+      <w:r>
+        <w:annotationRef/>
+      </w:r>
+      <w:r>
+        <w:t xml:space="preserve">13. Arbitraža za ZDA. V pogojih (točka 11d) imam določbo o zavezujoči arbitraži in odpovedi skupinski tožbi. Prevzela sem jo po zgledu ameriških storitev. Naj jo obdržim ali umaknem, dokler ZDA niso moj trg?</w:t>
+      </w:r>
+    </w:p>
+  </w:comment>
+  <w:comment w:id="27" w:author="Tina Zaletel" w:initials="TZ" w:date="2026-09-04T09:00:00Z">
+    <w:p>
+      <w:r>
+        <w:annotationRef/>
+      </w:r>
+      <w:r>
+        <w:t xml:space="preserve">17. Odstavki za funkcije, ki še ne delujejo. Nekaj določb (plačljivi trezor, naročnina, arbitraža) je pisanih vnaprej. Je bolje imeti jih zapisane in neuporabljene ali jih dodati šele, ko funkcija zaživi?</w:t>
+      </w:r>
+    </w:p>
+  </w:comment>
+  <w:comment w:id="28" w:author="Tina Zaletel" w:initials="TZ" w:date="2026-09-04T09:00:00Z">
+    <w:p>
+      <w:r>
+        <w:annotationRef/>
+      </w:r>
+      <w:r>
+        <w:t xml:space="preserve">Kam grem naprej (ni vprašanje, le da vam ni treba istega besedila pregledovati večkrat):</w:t>
+      </w:r>
+    </w:p>
+    <w:p>
+      <w:r>
+        <w:t xml:space="preserve">Da vam ni treba istega besedila pregledovati večkrat, na kratko še načrti za naslednje leto. Zanima me le, ali je pri kateri od teh smeri kaj takega, kar moram vedeti že zdaj: ali gre za regulirano dejavnost in ali bo treba pogoje bistveno predelati.</w:t>
+      </w:r>
+    </w:p>
+    <w:p>
+      <w:r>
+        <w:t xml:space="preserve">– vklop davčne blagajne (vprašanje 33) in prodajno mesto s plačilom na telefon (Stripe Tap to Pay, v Sloveniji v predogledu),</w:t>
+      </w:r>
+    </w:p>
+    <w:p>
+      <w:r>
+        <w:t xml:space="preserve">– povezava z banko (odprto bančništvo, PSD2), da uporabnik vidi plačila in označi račun kot plačan. Ali s tem postanem plačilni posrednik?</w:t>
+      </w:r>
+    </w:p>
+    <w:p>
+      <w:r>
+        <w:t xml:space="preserve">– kvalificirani časovni žig po eIDAS namesto sedanjega,</w:t>
+      </w:r>
+    </w:p>
+    <w:p>
+      <w:r>
+        <w:t xml:space="preserve">– priklop uporabnikovega lastnega AI in agenti, ki opravijo nalogo v njegovem imenu. Kdo odgovarja za izhod tujega modela?</w:t>
+      </w:r>
+    </w:p>
+    <w:p>
+      <w:r>
+        <w:t xml:space="preserve">– povezava z Gmailom prek OAuth (branje nabiralnika),</w:t>
+      </w:r>
+    </w:p>
+    <w:p>
+      <w:r>
+        <w:t xml:space="preserve">– priporočila in donacije, torej nagrada za povabljenega kolega,</w:t>
+      </w:r>
+    </w:p>
+    <w:p>
+      <w:r>
+        <w:t xml:space="preserve">– tuji trgi: najprej EU, nato ZDA, s plačili prek pooblaščenega ponudnika (Merchant of Record),</w:t>
+      </w:r>
+    </w:p>
+    <w:p>
+      <w:r>
+        <w:t xml:space="preserve">– mobilna aplikacija in naročnine prek trgovin,</w:t>
+      </w:r>
+    </w:p>
+    <w:p>
+      <w:r>
+        <w:t xml:space="preserve">– anonimna cenovna statistika kot javno dostopen ali plačljiv pregled trga.</w:t>
+      </w:r>
+    </w:p>
+  </w:comment>
+  <w:comment w:id="29" w:author="Tina Zaletel" w:initials="TZ" w:date="2026-09-04T09:00:00Z">
+    <w:p>
+      <w:r>
+        <w:annotationRef/>
+      </w:r>
+      <w:r>
+        <w:t xml:space="preserve">V orodju imam gumb, prek katerega se uporabnik lahko odloči za pravno pomoč, kadar želi pogodbo pregledati ali napisati bolj profesionalno. Iščem odvetnika ali pisarno, na katero bom lahko naslovila take stranke. Če koga poznate in bi ga to zanimalo, bom hvaležna za povezavo.</w:t>
+      </w:r>
+    </w:p>
+  </w:comment>
+</w:comments>
 </file>
 
 <file path=word/styles.xml><?xml version="1.0" encoding="utf-8"?>

</xml_diff>

<commit_message>
Paket za odvetnika: predlogi vnaprej (rdeče) — davčno potrjevanje, plačila na prodajnem mestu, profil podjetja in drugi podatki
Tina, 4. 9. 2026: besedila naj bodo pisana vnaprej, ne po vsaki funkciji.
Rdeči ležeči odstavki »PREDLOG DOPOLNITVE« v obeh Wordih:
- pogoji: nova 2c (izdaja računov in davčno potrjevanje, obe stanji —
  izklopljeno/vklopljeno; potrdilo; nedosegljivost FURS; storno) in 2d
  (plačila na prodajnem mestu prek Stripa), dodatek k 8a (Stripe POS, FURS
  kot javni organ, zunanji izvajalec);
- politika: točka 2 (profil podjetja — pri s.p. osebni podatek, naročnina,
  ekipa, evidenca delovnega časa, preverjanje strank, vprašalnik o cenah,
  potrdilo FURS, plačila na prodajnem mestu), 3 (zakonska obveznost;
  vprašalniki za stranke), 4 (dobe hrambe), 5a (Stripe POS, FURS, izvajalec,
  Supabase).
Vsak predlog ima komentar, da je pisan vnaprej (vprašanje 17). Besedilni
različici sta zdaj isti kot Worda.

Co-Authored-By: Claude Fable 5.1 <noreply@anthropic.com>
</commit_message>
<xml_diff>
--- a/docs/odvetnik-paket/2026-09-04/Pinart-Flow-Pogoji-uporabe-4-9-2026.docx
+++ b/docs/odvetnik-paket/2026-09-04/Pinart-Flow-Pogoji-uporabe-4-9-2026.docx
@@ -27,7 +27,7 @@
         <w:spacing w:after="120"/>
       </w:pPr>
       <w:r>
-        <w:t xml:space="preserve">Vprašanja so v komentarjih ob robu, vsako pri točki, na katero se nanaša. Oštevilčena so od 1 do 38: 1 do 18 kot v prvem pošiljanju (25. 8.), 19 do 28 pravice uporabe v kalkulatorju (26. 8.; prej pomotoma dvakrat številka 18), 29 do 38 novo. Vprašanja o osebnih podatkih so v politiki zasebnosti, vsa druga v pogojih uporabe; nobeno ni v obeh.</w:t>
+        <w:t xml:space="preserve">Rdeče in ležeče označeni odstavki so PREDLOGI DOPOLNITEV, ki še niso objavljeni — pisani vnaprej za funkcije, ki so zgrajene ali načrtovane (davčno potrjevanje, plačila na prodajnem mestu, novi podatki v politiki); prosim, da jih pregledate skupaj z živim besedilom. Vprašanja so v komentarjih ob robu, vsako pri točki, na katero se nanaša. Oštevilčena so od 1 do 38: 1 do 18 kot v prvem pošiljanju (25. 8.), 19 do 28 pravice uporabe v kalkulatorju (26. 8.; prej pomotoma dvakrat številka 18), 29 do 38 novo. Vprašanja o osebnih podatkih so v politiki zasebnosti, vsa druga v pogojih uporabe; nobeno ni v obeh.</w:t>
       </w:r>
     </w:p>
     <w:p>
@@ -250,6 +250,98 @@
     <w:p>
       <w:pPr>
         <w:spacing w:after="120"/>
+      </w:pPr>
+      <w:commentRangeStart w:id="8"/>
+      <w:r>
+        <w:rPr>
+          <w:i/>
+          <w:color w:val="C00000"/>
+        </w:rPr>
+        <w:t xml:space="preserve">PREDLOG DOPOLNITVE (še ni objavljeno): 2C. IZDAJA RAČUNOV IN DAVČNO POTRJEVANJE (ZDavPR)</w:t>
+      </w:r>
+      <w:commentRangeEnd w:id="8"/>
+      <w:r>
+        <w:commentReference w:id="8"/>
+      </w:r>
+    </w:p>
+    <w:p>
+      <w:pPr>
+        <w:spacing w:after="120"/>
+      </w:pPr>
+      <w:r>
+        <w:rPr>
+          <w:i/>
+          <w:color w:val="C00000"/>
+        </w:rPr>
+        <w:t xml:space="preserve">(1) Dokler funkcija davčnega potrjevanja v tvojem računu ni vklopljena, Pinart Flow ni davčna blagajna in računov ne potrjuje pri FURS. Računi, izdani v Flowu, so namenjeni plačilu z nakazilom na transakcijski račun. Če plačila prejemaš v gotovini, s plačilno kartico na prodajnem mestu ali na drug način, ki se šteje za gotovinsko poslovanje, moraš za izdajo takih računov uporabiti ustrezno davčno blagajno. Za skladnost s predpisi o davčnem potrjevanju računov odgovarjaš sam.</w:t>
+      </w:r>
+    </w:p>
+    <w:p>
+      <w:pPr>
+        <w:spacing w:after="120"/>
+      </w:pPr>
+      <w:r>
+        <w:rPr>
+          <w:i/>
+          <w:color w:val="C00000"/>
+        </w:rPr>
+        <w:t xml:space="preserve">(2) Ko ponudnik funkcijo davčnega potrjevanja omogoči in jo v nastavitvah vklopiš, Flow deluje kot programska oprema za izdajo in davčno potrjevanje računov: račune, plačane z gotovino ali kartico, pošlje v potrditev FURS v tvojem imenu in za tvoj račun, s tvojim namenskim digitalnim potrdilom, ter na račun zapiše ZOI, EOR in QR-kodo. Ti ostajaš zavezanec po ZDavPR in odgovarjaš za pravilnost in popolnost podatkov na računu, prijavo poslovnih prostorov, sprejem internega akta o številčenju, izročitev računa kupcu v elektronski ali papirni obliki ter za hrambo računov in potrdila. Ponudnik zagotavlja, da programska oprema ustreza tehničnim zahtevam FURS, in izda z zakonom predpisano izjavo o skladnosti.</w:t>
+      </w:r>
+    </w:p>
+    <w:p>
+      <w:pPr>
+        <w:spacing w:after="120"/>
+      </w:pPr>
+      <w:r>
+        <w:rPr>
+          <w:i/>
+          <w:color w:val="C00000"/>
+        </w:rPr>
+        <w:t xml:space="preserve">(3) Če FURS ni dosegljiv, se račun izda z ZOI brez EOR, Flow pa ga pošlje v naknadno potrditev v zakonskem roku. Popravki izdanih računov so mogoči le s stornom po pravilih ZDavPR.</w:t>
+      </w:r>
+    </w:p>
+    <w:p>
+      <w:pPr>
+        <w:spacing w:after="120"/>
+      </w:pPr>
+      <w:r>
+        <w:rPr>
+          <w:i/>
+          <w:color w:val="C00000"/>
+        </w:rPr>
+        <w:t xml:space="preserve">(4) Tvoje namensko digitalno potrdilo hranimo šifrirano in ga uporabljamo izključno za podpisovanje sporočil FURS v tvojem imenu; ob izklopu funkcije ali izbrisu računa ga izbrišemo. Del obdelave lahko izvaja podobdelovalec iz točke 8a na strežnikih v EU.</w:t>
+      </w:r>
+    </w:p>
+    <w:p>
+      <w:pPr>
+        <w:spacing w:after="120"/>
+        <w:keepNext/>
+      </w:pPr>
+      <w:r>
+        <w:rPr>
+          <w:b/>
+          <w:i/>
+          <w:sz w:val="24"/>
+          <w:color w:val="C00000"/>
+        </w:rPr>
+        <w:t xml:space="preserve">2D. PLAČILA NA PRODAJNEM MESTU</w:t>
+      </w:r>
+    </w:p>
+    <w:p>
+      <w:pPr>
+        <w:spacing w:after="120"/>
+      </w:pPr>
+      <w:r>
+        <w:rPr>
+          <w:i/>
+          <w:color w:val="C00000"/>
+        </w:rPr>
+        <w:t xml:space="preserve">Ko ponudnik funkcijo omogoči, lahko plačila s kartico na prodajnem mestu (čitalnik ali plačilo na telefon) sprejemaš prek plačilnih storitev Stripe. Plačilo poteka po pogojih Stripa in prek tvojega računa pri Stripu, povezanega s Flowom; ponudnik ne prejema, ne hrani in ne posreduje sredstev ter ni plačilna institucija. Provizije Stripa nosiš ti. Ponudnik ne odgovarja za zavrnjena plačila, vračila in ugovore (chargeback) med tabo, tvojo stranko in Stripom. Za vsako tako plačilo moraš izdati račun po točki 2c. Podatkov o kartici ponudnik ne prejme; Flow prejme le znesek, čas, način plačila, zadnje štiri številke kartice in identifikator plačila.</w:t>
+      </w:r>
+    </w:p>
+    <w:p>
+      <w:pPr>
+        <w:spacing w:after="120"/>
         <w:keepNext/>
       </w:pPr>
       <w:r>
@@ -273,7 +365,7 @@
         <w:spacing w:after="120"/>
         <w:keepNext/>
       </w:pPr>
-      <w:commentRangeStart w:id="8"/>
+      <w:commentRangeStart w:id="9"/>
       <w:r>
         <w:rPr>
           <w:b/>
@@ -281,9 +373,9 @@
         </w:rPr>
         <w:t xml:space="preserve">3A. BETA / ZGODNJI DOSTOP</w:t>
       </w:r>
-      <w:commentRangeEnd w:id="8"/>
-      <w:r>
-        <w:commentReference w:id="8"/>
+      <w:commentRangeEnd w:id="9"/>
+      <w:r>
+        <w:commentReference w:id="9"/>
       </w:r>
     </w:p>
     <w:p>
@@ -412,7 +504,7 @@
         <w:spacing w:after="120"/>
         <w:keepNext/>
       </w:pPr>
-      <w:commentRangeStart w:id="9"/>
+      <w:commentRangeStart w:id="10"/>
       <w:r>
         <w:rPr>
           <w:b/>
@@ -420,9 +512,9 @@
         </w:rPr>
         <w:t xml:space="preserve">4C. SEF AVTORSTVA</w:t>
       </w:r>
-      <w:commentRangeEnd w:id="9"/>
-      <w:r>
-        <w:commentReference w:id="9"/>
+      <w:commentRangeEnd w:id="10"/>
+      <w:r>
+        <w:commentReference w:id="10"/>
       </w:r>
     </w:p>
     <w:p>
@@ -517,8 +609,8 @@
         <w:spacing w:after="120"/>
         <w:keepNext/>
       </w:pPr>
-      <w:commentRangeStart w:id="10"/>
       <w:commentRangeStart w:id="11"/>
+      <w:commentRangeStart w:id="12"/>
       <w:r>
         <w:rPr>
           <w:b/>
@@ -526,14 +618,14 @@
         </w:rPr>
         <w:t xml:space="preserve">4G. OBDELAVA OSEBNIH PODATKOV V TVOJEM IMENU (POGODBA O OBDELAVI)</w:t>
       </w:r>
-      <w:commentRangeEnd w:id="10"/>
-      <w:r>
-        <w:commentReference w:id="10"/>
-      </w:r>
       <w:commentRangeEnd w:id="11"/>
       <w:r>
         <w:commentReference w:id="11"/>
       </w:r>
+      <w:commentRangeEnd w:id="12"/>
+      <w:r>
+        <w:commentReference w:id="12"/>
+      </w:r>
     </w:p>
     <w:p>
       <w:pPr>
@@ -659,7 +751,6 @@
         <w:spacing w:after="120"/>
         <w:keepNext/>
       </w:pPr>
-      <w:commentRangeStart w:id="12"/>
       <w:commentRangeStart w:id="13"/>
       <w:commentRangeStart w:id="14"/>
       <w:commentRangeStart w:id="15"/>
@@ -669,6 +760,7 @@
       <w:commentRangeStart w:id="19"/>
       <w:commentRangeStart w:id="20"/>
       <w:commentRangeStart w:id="21"/>
+      <w:commentRangeStart w:id="22"/>
       <w:r>
         <w:rPr>
           <w:b/>
@@ -676,10 +768,6 @@
         </w:rPr>
         <w:t xml:space="preserve">8. INTELEKTUALNA LASTNINA</w:t>
       </w:r>
-      <w:commentRangeEnd w:id="12"/>
-      <w:r>
-        <w:commentReference w:id="12"/>
-      </w:r>
       <w:commentRangeEnd w:id="13"/>
       <w:r>
         <w:commentReference w:id="13"/>
@@ -716,6 +804,10 @@
       <w:r>
         <w:commentReference w:id="21"/>
       </w:r>
+      <w:commentRangeEnd w:id="22"/>
+      <w:r>
+        <w:commentReference w:id="22"/>
+      </w:r>
     </w:p>
     <w:p>
       <w:pPr>
@@ -821,6 +913,23 @@
     <w:p>
       <w:pPr>
         <w:spacing w:after="120"/>
+      </w:pPr>
+      <w:commentRangeStart w:id="23"/>
+      <w:r>
+        <w:rPr>
+          <w:i/>
+          <w:color w:val="C00000"/>
+        </w:rPr>
+        <w:t xml:space="preserve">PREDLOG DOPOLNITVE (še ni objavljeno): Podobdelovalci in prejemniki, ki veljajo, ko so funkcije iz točk 2c in 2d omogočene: Stripe — plačila na prodajnem mestu; FURS (Finančna uprava RS) — prejemnik podatkov računov pri davčnem potrjevanju (javni organ na podlagi ZDavPR, ne podobdelovalec); zunanji izvajalec davčnega potrjevanja — [ime in sedež], strežniki v EU, pogodba o obdelavi.</w:t>
+      </w:r>
+      <w:commentRangeEnd w:id="23"/>
+      <w:r>
+        <w:commentReference w:id="23"/>
+      </w:r>
+    </w:p>
+    <w:p>
+      <w:pPr>
+        <w:spacing w:after="120"/>
         <w:keepNext/>
       </w:pPr>
       <w:r>
@@ -844,7 +953,7 @@
         <w:spacing w:after="120"/>
         <w:keepNext/>
       </w:pPr>
-      <w:commentRangeStart w:id="22"/>
+      <w:commentRangeStart w:id="24"/>
       <w:r>
         <w:rPr>
           <w:b/>
@@ -852,9 +961,9 @@
         </w:rPr>
         <w:t xml:space="preserve">8C. PRIJAVA SPORNE VSEBINE IN JAMSTVO</w:t>
       </w:r>
-      <w:commentRangeEnd w:id="22"/>
-      <w:r>
-        <w:commentReference w:id="22"/>
+      <w:commentRangeEnd w:id="24"/>
+      <w:r>
+        <w:commentReference w:id="24"/>
       </w:r>
     </w:p>
     <w:p>
@@ -912,8 +1021,8 @@
         <w:spacing w:after="120"/>
         <w:keepNext/>
       </w:pPr>
-      <w:commentRangeStart w:id="23"/>
-      <w:commentRangeStart w:id="24"/>
+      <w:commentRangeStart w:id="25"/>
+      <w:commentRangeStart w:id="26"/>
       <w:r>
         <w:rPr>
           <w:b/>
@@ -921,13 +1030,13 @@
         </w:rPr>
         <w:t xml:space="preserve">9A. ODLOČITVE NA PODLAGI ORODJA IN AI</w:t>
       </w:r>
-      <w:commentRangeEnd w:id="23"/>
-      <w:r>
-        <w:commentReference w:id="23"/>
-      </w:r>
-      <w:commentRangeEnd w:id="24"/>
-      <w:r>
-        <w:commentReference w:id="24"/>
+      <w:commentRangeEnd w:id="25"/>
+      <w:r>
+        <w:commentReference w:id="25"/>
+      </w:r>
+      <w:commentRangeEnd w:id="26"/>
+      <w:r>
+        <w:commentReference w:id="26"/>
       </w:r>
     </w:p>
     <w:p>
@@ -1027,7 +1136,7 @@
         <w:spacing w:after="120"/>
         <w:keepNext/>
       </w:pPr>
-      <w:commentRangeStart w:id="25"/>
+      <w:commentRangeStart w:id="27"/>
       <w:r>
         <w:rPr>
           <w:b/>
@@ -1035,9 +1144,9 @@
         </w:rPr>
         <w:t xml:space="preserve">10B. PRENEHANJE STORITVE IN IZVOZ PODATKOV</w:t>
       </w:r>
-      <w:commentRangeEnd w:id="25"/>
-      <w:r>
-        <w:commentReference w:id="25"/>
+      <w:commentRangeEnd w:id="27"/>
+      <w:r>
+        <w:commentReference w:id="27"/>
       </w:r>
     </w:p>
     <w:p>
@@ -1137,7 +1246,7 @@
         <w:spacing w:after="120"/>
         <w:keepNext/>
       </w:pPr>
-      <w:commentRangeStart w:id="26"/>
+      <w:commentRangeStart w:id="28"/>
       <w:r>
         <w:rPr>
           <w:b/>
@@ -1145,9 +1254,9 @@
         </w:rPr>
         <w:t xml:space="preserve">11D. REŠEVANJE SPOROV ZA UPORABNIKE V ZDA (ARBITRAŽA)</w:t>
       </w:r>
-      <w:commentRangeEnd w:id="26"/>
-      <w:r>
-        <w:commentReference w:id="26"/>
+      <w:commentRangeEnd w:id="28"/>
+      <w:r>
+        <w:commentReference w:id="28"/>
       </w:r>
     </w:p>
     <w:p>
@@ -1184,9 +1293,9 @@
         <w:spacing w:after="120"/>
         <w:keepNext/>
       </w:pPr>
-      <w:commentRangeStart w:id="27"/>
-      <w:commentRangeStart w:id="28"/>
       <w:commentRangeStart w:id="29"/>
+      <w:commentRangeStart w:id="30"/>
+      <w:commentRangeStart w:id="31"/>
       <w:r>
         <w:rPr>
           <w:b/>
@@ -1194,17 +1303,17 @@
         </w:rPr>
         <w:t xml:space="preserve">13. SPREMEMBE</w:t>
       </w:r>
-      <w:commentRangeEnd w:id="27"/>
-      <w:r>
-        <w:commentReference w:id="27"/>
-      </w:r>
-      <w:commentRangeEnd w:id="28"/>
-      <w:r>
-        <w:commentReference w:id="28"/>
-      </w:r>
       <w:commentRangeEnd w:id="29"/>
       <w:r>
         <w:commentReference w:id="29"/>
+      </w:r>
+      <w:commentRangeEnd w:id="30"/>
+      <w:r>
+        <w:commentReference w:id="30"/>
+      </w:r>
+      <w:commentRangeEnd w:id="31"/>
+      <w:r>
+        <w:commentReference w:id="31"/>
       </w:r>
     </w:p>
     <w:p>
@@ -1329,11 +1438,21 @@
         <w:annotationRef/>
       </w:r>
       <w:r>
+        <w:t xml:space="preserve">Napisano vnaprej, da pogojev ne pošiljam v pregled ob vsaki novi funkciji (vprašanje 17: raje zapisano in neuporabljeno). Prosim za pregled obeh stanj — dokler je funkcija izklopljena in ko jo uporabnik vklopi. Besedilo v ležečem tisku še ni objavljeno.</w:t>
+      </w:r>
+    </w:p>
+  </w:comment>
+  <w:comment w:id="9" w:author="Tina Zaletel" w:initials="TZ" w:date="2026-09-04T09:00:00Z">
+    <w:p>
+      <w:r>
+        <w:annotationRef/>
+      </w:r>
+      <w:r>
         <w:t xml:space="preserve">8. Zaprta beta. Dostop je po vabilu, funkcije se še spreminjajo, podatki se lahko ponastavijo. Kako to zapisati, da je pošteno in hkrati varno?</w:t>
       </w:r>
     </w:p>
   </w:comment>
-  <w:comment w:id="9" w:author="Tina Zaletel" w:initials="TZ" w:date="2026-09-04T09:00:00Z">
+  <w:comment w:id="10" w:author="Tina Zaletel" w:initials="TZ" w:date="2026-09-04T09:00:00Z">
     <w:p>
       <w:r>
         <w:annotationRef/>
@@ -1343,7 +1462,7 @@
       </w:r>
     </w:p>
   </w:comment>
-  <w:comment w:id="10" w:author="Tina Zaletel" w:initials="TZ" w:date="2026-09-04T09:00:00Z">
+  <w:comment w:id="11" w:author="Tina Zaletel" w:initials="TZ" w:date="2026-09-04T09:00:00Z">
     <w:p>
       <w:r>
         <w:annotationRef/>
@@ -1353,7 +1472,7 @@
       </w:r>
     </w:p>
   </w:comment>
-  <w:comment w:id="11" w:author="Tina Zaletel" w:initials="TZ" w:date="2026-09-04T09:00:00Z">
+  <w:comment w:id="12" w:author="Tina Zaletel" w:initials="TZ" w:date="2026-09-04T09:00:00Z">
     <w:p>
       <w:r>
         <w:annotationRef/>
@@ -1363,7 +1482,7 @@
       </w:r>
     </w:p>
   </w:comment>
-  <w:comment w:id="12" w:author="Tina Zaletel" w:initials="TZ" w:date="2026-09-04T09:00:00Z">
+  <w:comment w:id="13" w:author="Tina Zaletel" w:initials="TZ" w:date="2026-09-04T09:00:00Z">
     <w:p>
       <w:r>
         <w:annotationRef/>
@@ -1373,7 +1492,7 @@
       </w:r>
     </w:p>
   </w:comment>
-  <w:comment w:id="13" w:author="Tina Zaletel" w:initials="TZ" w:date="2026-09-04T09:00:00Z">
+  <w:comment w:id="14" w:author="Tina Zaletel" w:initials="TZ" w:date="2026-09-04T09:00:00Z">
     <w:p>
       <w:r>
         <w:annotationRef/>
@@ -1383,7 +1502,7 @@
       </w:r>
     </w:p>
   </w:comment>
-  <w:comment w:id="14" w:author="Tina Zaletel" w:initials="TZ" w:date="2026-09-04T09:00:00Z">
+  <w:comment w:id="15" w:author="Tina Zaletel" w:initials="TZ" w:date="2026-09-04T09:00:00Z">
     <w:p>
       <w:r>
         <w:annotationRef/>
@@ -1393,7 +1512,7 @@
       </w:r>
     </w:p>
   </w:comment>
-  <w:comment w:id="15" w:author="Tina Zaletel" w:initials="TZ" w:date="2026-09-04T09:00:00Z">
+  <w:comment w:id="16" w:author="Tina Zaletel" w:initials="TZ" w:date="2026-09-04T09:00:00Z">
     <w:p>
       <w:r>
         <w:annotationRef/>
@@ -1403,7 +1522,7 @@
       </w:r>
     </w:p>
   </w:comment>
-  <w:comment w:id="16" w:author="Tina Zaletel" w:initials="TZ" w:date="2026-09-04T09:00:00Z">
+  <w:comment w:id="17" w:author="Tina Zaletel" w:initials="TZ" w:date="2026-09-04T09:00:00Z">
     <w:p>
       <w:r>
         <w:annotationRef/>
@@ -1413,7 +1532,7 @@
       </w:r>
     </w:p>
   </w:comment>
-  <w:comment w:id="17" w:author="Tina Zaletel" w:initials="TZ" w:date="2026-09-04T09:00:00Z">
+  <w:comment w:id="18" w:author="Tina Zaletel" w:initials="TZ" w:date="2026-09-04T09:00:00Z">
     <w:p>
       <w:r>
         <w:annotationRef/>
@@ -1423,7 +1542,7 @@
       </w:r>
     </w:p>
   </w:comment>
-  <w:comment w:id="18" w:author="Tina Zaletel" w:initials="TZ" w:date="2026-09-04T09:00:00Z">
+  <w:comment w:id="19" w:author="Tina Zaletel" w:initials="TZ" w:date="2026-09-04T09:00:00Z">
     <w:p>
       <w:r>
         <w:annotationRef/>
@@ -1433,7 +1552,7 @@
       </w:r>
     </w:p>
   </w:comment>
-  <w:comment w:id="19" w:author="Tina Zaletel" w:initials="TZ" w:date="2026-09-04T09:00:00Z">
+  <w:comment w:id="20" w:author="Tina Zaletel" w:initials="TZ" w:date="2026-09-04T09:00:00Z">
     <w:p>
       <w:r>
         <w:annotationRef/>
@@ -1443,7 +1562,7 @@
       </w:r>
     </w:p>
   </w:comment>
-  <w:comment w:id="20" w:author="Tina Zaletel" w:initials="TZ" w:date="2026-09-04T09:00:00Z">
+  <w:comment w:id="21" w:author="Tina Zaletel" w:initials="TZ" w:date="2026-09-04T09:00:00Z">
     <w:p>
       <w:r>
         <w:annotationRef/>
@@ -1453,7 +1572,7 @@
       </w:r>
     </w:p>
   </w:comment>
-  <w:comment w:id="21" w:author="Tina Zaletel" w:initials="TZ" w:date="2026-09-04T09:00:00Z">
+  <w:comment w:id="22" w:author="Tina Zaletel" w:initials="TZ" w:date="2026-09-04T09:00:00Z">
     <w:p>
       <w:r>
         <w:annotationRef/>
@@ -1483,7 +1602,17 @@
       </w:r>
     </w:p>
   </w:comment>
-  <w:comment w:id="22" w:author="Tina Zaletel" w:initials="TZ" w:date="2026-09-04T09:00:00Z">
+  <w:comment w:id="23" w:author="Tina Zaletel" w:initials="TZ" w:date="2026-09-04T09:00:00Z">
+    <w:p>
+      <w:r>
+        <w:annotationRef/>
+      </w:r>
+      <w:r>
+        <w:t xml:space="preserve">Napisano vnaprej, da pogojev ne pošiljam v pregled ob vsaki novi funkciji (vprašanje 17: raje zapisano in neuporabljeno). Prosim za pregled obeh stanj — dokler je funkcija izklopljena in ko jo uporabnik vklopi. Besedilo v ležečem tisku še ni objavljeno.</w:t>
+      </w:r>
+    </w:p>
+  </w:comment>
+  <w:comment w:id="24" w:author="Tina Zaletel" w:initials="TZ" w:date="2026-09-04T09:00:00Z">
     <w:p>
       <w:r>
         <w:annotationRef/>
@@ -1493,7 +1622,7 @@
       </w:r>
     </w:p>
   </w:comment>
-  <w:comment w:id="23" w:author="Tina Zaletel" w:initials="TZ" w:date="2026-09-04T09:00:00Z">
+  <w:comment w:id="25" w:author="Tina Zaletel" w:initials="TZ" w:date="2026-09-04T09:00:00Z">
     <w:p>
       <w:r>
         <w:annotationRef/>
@@ -1503,7 +1632,7 @@
       </w:r>
     </w:p>
   </w:comment>
-  <w:comment w:id="24" w:author="Tina Zaletel" w:initials="TZ" w:date="2026-09-04T09:00:00Z">
+  <w:comment w:id="26" w:author="Tina Zaletel" w:initials="TZ" w:date="2026-09-04T09:00:00Z">
     <w:p>
       <w:r>
         <w:annotationRef/>
@@ -1513,7 +1642,7 @@
       </w:r>
     </w:p>
   </w:comment>
-  <w:comment w:id="25" w:author="Tina Zaletel" w:initials="TZ" w:date="2026-09-04T09:00:00Z">
+  <w:comment w:id="27" w:author="Tina Zaletel" w:initials="TZ" w:date="2026-09-04T09:00:00Z">
     <w:p>
       <w:r>
         <w:annotationRef/>
@@ -1523,7 +1652,7 @@
       </w:r>
     </w:p>
   </w:comment>
-  <w:comment w:id="26" w:author="Tina Zaletel" w:initials="TZ" w:date="2026-09-04T09:00:00Z">
+  <w:comment w:id="28" w:author="Tina Zaletel" w:initials="TZ" w:date="2026-09-04T09:00:00Z">
     <w:p>
       <w:r>
         <w:annotationRef/>
@@ -1533,7 +1662,7 @@
       </w:r>
     </w:p>
   </w:comment>
-  <w:comment w:id="27" w:author="Tina Zaletel" w:initials="TZ" w:date="2026-09-04T09:00:00Z">
+  <w:comment w:id="29" w:author="Tina Zaletel" w:initials="TZ" w:date="2026-09-04T09:00:00Z">
     <w:p>
       <w:r>
         <w:annotationRef/>
@@ -1543,7 +1672,7 @@
       </w:r>
     </w:p>
   </w:comment>
-  <w:comment w:id="28" w:author="Tina Zaletel" w:initials="TZ" w:date="2026-09-04T09:00:00Z">
+  <w:comment w:id="30" w:author="Tina Zaletel" w:initials="TZ" w:date="2026-09-04T09:00:00Z">
     <w:p>
       <w:r>
         <w:annotationRef/>
@@ -1603,7 +1732,7 @@
       </w:r>
     </w:p>
   </w:comment>
-  <w:comment w:id="29" w:author="Tina Zaletel" w:initials="TZ" w:date="2026-09-04T09:00:00Z">
+  <w:comment w:id="31" w:author="Tina Zaletel" w:initials="TZ" w:date="2026-09-04T09:00:00Z">
     <w:p>
       <w:r>
         <w:annotationRef/>

</xml_diff>

<commit_message>
Paket za odvetnika: davčno potrjevanje pri zunanjem izvajalcu v ločeni bazi
Tina, 4. 9.: obdelavo bo delal zunanji izvajalec (Patrik) v ločeni bazi pri
drugem ponudniku gostovanja. Povsod enotni prazni mesti [FIRMA IZVAJALCA]
in [PONUDNIK GOSTOVANJA] — pogoji 2c(4) in 8a, politika 2, 4, 5 in 5a.

Co-Authored-By: Claude Fable 5.1 <noreply@anthropic.com>
</commit_message>
<xml_diff>
--- a/docs/odvetnik-paket/2026-09-04/Pinart-Flow-Pogoji-uporabe-4-9-2026.docx
+++ b/docs/odvetnik-paket/2026-09-04/Pinart-Flow-Pogoji-uporabe-4-9-2026.docx
@@ -27,7 +27,7 @@
         <w:spacing w:after="120"/>
       </w:pPr>
       <w:r>
-        <w:t xml:space="preserve">Rdeče in ležeče označeni odstavki so PREDLOGI DOPOLNITEV, ki še niso objavljeni — pisani vnaprej za funkcije, ki so zgrajene ali načrtovane (davčno potrjevanje, plačila na prodajnem mestu, novi podatki v politiki); prosim, da jih pregledate skupaj z živim besedilom. Vprašanja so v komentarjih ob robu, vsako pri točki, na katero se nanaša. Oštevilčena so od 1 do 38: 1 do 18 kot v prvem pošiljanju (25. 8.), 19 do 28 pravice uporabe v kalkulatorju (26. 8.; prej pomotoma dvakrat številka 18), 29 do 38 novo. Vprašanja o osebnih podatkih so v politiki zasebnosti, vsa druga v pogojih uporabe; nobeno ni v obeh.</w:t>
+        <w:t xml:space="preserve">Rdeče in ležeče označeni odstavki so PREDLOGI DOPOLNITEV, ki še niso objavljeni — pisani vnaprej za funkcije, ki so zgrajene ali načrtovane (davčno potrjevanje, plačila na prodajnem mestu, novi podatki v politiki); prosim, da jih pregledate skupaj z živim besedilom. Dve prazni mesti izpolnim pred objavo: [FIRMA IZVAJALCA] (zunanji izvajalec davčnega potrjevanja) in [PONUDNIK GOSTOVANJA] (kjer bo njegova ločena podatkovna baza). Vprašanja so v komentarjih ob robu, vsako pri točki, na katero se nanaša. Oštevilčena so od 1 do 38: 1 do 18 kot v prvem pošiljanju (25. 8.), 19 do 28 pravice uporabe v kalkulatorju (26. 8.; prej pomotoma dvakrat številka 18), 29 do 38 novo. Vprašanja o osebnih podatkih so v politiki zasebnosti, vsa druga v pogojih uporabe; nobeno ni v obeh.</w:t>
       </w:r>
     </w:p>
     <w:p>
@@ -309,7 +309,7 @@
           <w:i/>
           <w:color w:val="C00000"/>
         </w:rPr>
-        <w:t xml:space="preserve">(4) Tvoje namensko digitalno potrdilo hranimo šifrirano in ga uporabljamo izključno za podpisovanje sporočil FURS v tvojem imenu; ob izklopu funkcije ali izbrisu računa ga izbrišemo. Del obdelave lahko izvaja podobdelovalec iz točke 8a na strežnikih v EU.</w:t>
+        <w:t xml:space="preserve">(4) Davčno potrjevanje zate izvaja zunanji izvajalec [FIRMA IZVAJALCA] (točka 8a) v ločeni podatkovni bazi na strežnikih ponudnika gostovanja [PONUDNIK GOSTOVANJA] v Sloveniji oziroma EU, po pogodbi o obdelavi s ponudnikom. Tam sta shranjena tvoje namensko digitalno potrdilo (šifrirano) in podatki računov, poslanih v potrditev. Potrdilo se uporablja izključno za podpisovanje sporočil FURS v tvojem imenu; ob izklopu funkcije ali izbrisu računa se izbriše.</w:t>
       </w:r>
     </w:p>
     <w:p>
@@ -920,7 +920,7 @@
           <w:i/>
           <w:color w:val="C00000"/>
         </w:rPr>
-        <w:t xml:space="preserve">PREDLOG DOPOLNITVE (še ni objavljeno): Podobdelovalci in prejemniki, ki veljajo, ko so funkcije iz točk 2c in 2d omogočene: Stripe — plačila na prodajnem mestu; FURS (Finančna uprava RS) — prejemnik podatkov računov pri davčnem potrjevanju (javni organ na podlagi ZDavPR, ne podobdelovalec); zunanji izvajalec davčnega potrjevanja — [ime in sedež], strežniki v EU, pogodba o obdelavi.</w:t>
+        <w:t xml:space="preserve">PREDLOG DOPOLNITVE (še ni objavljeno): Podobdelovalci in prejemniki, ki veljajo, ko so funkcije iz točk 2c in 2d omogočene: Stripe — plačila na prodajnem mestu; FURS (Finančna uprava RS) — prejemnik podatkov računov pri davčnem potrjevanju (javni organ na podlagi ZDavPR, ne podobdelovalec); [FIRMA IZVAJALCA], [naslov] — zunanji izvajalec davčnega potrjevanja, ločena podatkovna baza, pogodba o obdelavi; [PONUDNIK GOSTOVANJA], [naslov] — gostovanje strežnika in podatkovne baze zunanjega izvajalca (Slovenija/EU).</w:t>
       </w:r>
       <w:commentRangeEnd w:id="23"/>
       <w:r>

</xml_diff>